<commit_message>
Add Moore FSM compilation and submission artifacts
Add compiled Mealy and Moore sequence-detector simulation binaries for the 1001 FSM assignment.

Refresh the Mealy, Moore non-overlapping, and Moore overlapping VCD waveforms produced by the validated testbenches.

Include the updated Assignment 6 DOCX and the generated Day 3 submission PDF.

Validation: iverilog -g2012 and vvp pass all three Assignment 6 testbenches.
</commit_message>
<xml_diff>
--- a/DAY3/Assignment 6/Assignmnet 6.docx
+++ b/DAY3/Assignment 6/Assignmnet 6.docx
@@ -28,16 +28,45 @@
       <w:r>
         <w:t xml:space="preserve">GitHub Link : </w:t>
       </w:r>
+      <w:hyperlink r:id="rId5" w:history="1">
+        <w:r>
+          <w:rPr>
+            <w:rStyle w:val="Hyperlink"/>
+          </w:rPr>
+          <w:t>https://github.com/ssbagi/IBM_OpenPOWER_and_SoC_Design/tree/main/DAY3/Assignment%206</w:t>
+        </w:r>
+      </w:hyperlink>
+      <w:r>
+        <w:t xml:space="preserve"> </w:t>
+      </w:r>
     </w:p>
     <w:p>
       <w:r>
         <w:t xml:space="preserve">README.md Link : </w:t>
       </w:r>
+      <w:hyperlink r:id="rId6" w:history="1">
+        <w:r>
+          <w:rPr>
+            <w:rStyle w:val="Hyperlink"/>
+          </w:rPr>
+          <w:t>https://github.com/ssbagi/IBM_OpenPOWER_and_SoC_Design/blob/main/DAY3/Assignment%206/README.md</w:t>
+        </w:r>
+      </w:hyperlink>
+      <w:r>
+        <w:t xml:space="preserve"> </w:t>
+      </w:r>
     </w:p>
     <w:p/>
     <w:p>
       <w:r>
-        <w:t xml:space="preserve">Question : </w:t>
+        <w:rPr>
+          <w:b/>
+          <w:bCs/>
+        </w:rPr>
+        <w:t>Question :</w:t>
+      </w:r>
+      <w:r>
+        <w:t xml:space="preserve"> </w:t>
       </w:r>
       <w:r>
         <w:t>Design and simulate a sequence detector for detecting '1001'</w:t>
@@ -84,7 +113,7 @@
                     </pic:cNvPicPr>
                   </pic:nvPicPr>
                   <pic:blipFill>
-                    <a:blip r:embed="rId5" cstate="print">
+                    <a:blip r:embed="rId7" cstate="print">
                       <a:extLst>
                         <a:ext uri="{28A0092B-C50C-407E-A947-70E740481C1C}">
                           <a14:useLocalDpi xmlns:a14="http://schemas.microsoft.com/office/drawing/2010/main" val="0"/>
@@ -166,41 +195,8 @@
         <w:pStyle w:val="ListParagraph"/>
       </w:pPr>
     </w:p>
-    <w:p>
-      <w:pPr>
-        <w:pStyle w:val="ListParagraph"/>
-      </w:pPr>
-    </w:p>
-    <w:p>
-      <w:pPr>
-        <w:pStyle w:val="ListParagraph"/>
-      </w:pPr>
-    </w:p>
-    <w:p>
-      <w:pPr>
-        <w:pStyle w:val="ListParagraph"/>
-      </w:pPr>
-    </w:p>
-    <w:p>
-      <w:pPr>
-        <w:pStyle w:val="ListParagraph"/>
-      </w:pPr>
-    </w:p>
-    <w:p>
-      <w:pPr>
-        <w:pStyle w:val="ListParagraph"/>
-      </w:pPr>
-    </w:p>
-    <w:p>
-      <w:pPr>
-        <w:pStyle w:val="ListParagraph"/>
-      </w:pPr>
-    </w:p>
-    <w:p>
-      <w:pPr>
-        <w:pStyle w:val="ListParagraph"/>
-      </w:pPr>
-    </w:p>
+    <w:p/>
+    <w:p/>
     <w:p>
       <w:pPr>
         <w:pStyle w:val="ListParagraph"/>
@@ -227,8 +223,16 @@
     <w:p>
       <w:pPr>
         <w:pStyle w:val="ListParagraph"/>
-      </w:pPr>
-      <w:r>
+        <w:rPr>
+          <w:b/>
+          <w:bCs/>
+        </w:rPr>
+      </w:pPr>
+      <w:r>
+        <w:rPr>
+          <w:b/>
+          <w:bCs/>
+        </w:rPr>
         <w:t xml:space="preserve">Verilog Code : </w:t>
       </w:r>
     </w:p>
@@ -880,57 +884,211 @@
     <w:p>
       <w:pPr>
         <w:pStyle w:val="ListParagraph"/>
-      </w:pPr>
-    </w:p>
-    <w:p>
-      <w:pPr>
-        <w:pStyle w:val="ListParagraph"/>
-      </w:pPr>
-    </w:p>
-    <w:p>
-      <w:pPr>
-        <w:pStyle w:val="ListParagraph"/>
-      </w:pPr>
-    </w:p>
-    <w:p>
-      <w:pPr>
-        <w:pStyle w:val="ListParagraph"/>
-      </w:pPr>
-    </w:p>
-    <w:p>
-      <w:pPr>
-        <w:pStyle w:val="ListParagraph"/>
-      </w:pPr>
-    </w:p>
-    <w:p>
-      <w:pPr>
-        <w:pStyle w:val="ListParagraph"/>
-      </w:pPr>
-    </w:p>
-    <w:p>
-      <w:pPr>
-        <w:pStyle w:val="ListParagraph"/>
-      </w:pPr>
-    </w:p>
-    <w:p>
-      <w:pPr>
-        <w:pStyle w:val="ListParagraph"/>
-      </w:pPr>
-    </w:p>
-    <w:p>
-      <w:pPr>
-        <w:pStyle w:val="ListParagraph"/>
-      </w:pPr>
-    </w:p>
-    <w:p>
-      <w:pPr>
-        <w:pStyle w:val="ListParagraph"/>
-      </w:pPr>
-    </w:p>
-    <w:p>
-      <w:pPr>
-        <w:pStyle w:val="ListParagraph"/>
-      </w:pPr>
+        <w:rPr>
+          <w:b/>
+          <w:bCs/>
+        </w:rPr>
+      </w:pPr>
+      <w:r>
+        <w:rPr>
+          <w:b/>
+          <w:bCs/>
+        </w:rPr>
+        <w:t xml:space="preserve">Compilation Log : </w:t>
+      </w:r>
+    </w:p>
+    <w:p>
+      <w:pPr>
+        <w:pStyle w:val="ListParagraph"/>
+      </w:pPr>
+      <w:r>
+        <w:rPr>
+          <w:noProof/>
+        </w:rPr>
+        <w:drawing>
+          <wp:inline distT="0" distB="0" distL="0" distR="0" wp14:anchorId="17D6011A" wp14:editId="60C2C88B">
+            <wp:extent cx="5731510" cy="3220085"/>
+            <wp:effectExtent l="0" t="0" r="2540" b="0"/>
+            <wp:docPr id="1293043138" name="Picture 1"/>
+            <wp:cNvGraphicFramePr>
+              <a:graphicFrameLocks xmlns:a="http://schemas.openxmlformats.org/drawingml/2006/main" noChangeAspect="1"/>
+            </wp:cNvGraphicFramePr>
+            <a:graphic xmlns:a="http://schemas.openxmlformats.org/drawingml/2006/main">
+              <a:graphicData uri="http://schemas.openxmlformats.org/drawingml/2006/picture">
+                <pic:pic xmlns:pic="http://schemas.openxmlformats.org/drawingml/2006/picture">
+                  <pic:nvPicPr>
+                    <pic:cNvPr id="1293043138" name=""/>
+                    <pic:cNvPicPr/>
+                  </pic:nvPicPr>
+                  <pic:blipFill>
+                    <a:blip r:embed="rId8"/>
+                    <a:stretch>
+                      <a:fillRect/>
+                    </a:stretch>
+                  </pic:blipFill>
+                  <pic:spPr>
+                    <a:xfrm>
+                      <a:off x="0" y="0"/>
+                      <a:ext cx="5731510" cy="3220085"/>
+                    </a:xfrm>
+                    <a:prstGeom prst="rect">
+                      <a:avLst/>
+                    </a:prstGeom>
+                  </pic:spPr>
+                </pic:pic>
+              </a:graphicData>
+            </a:graphic>
+          </wp:inline>
+        </w:drawing>
+      </w:r>
+    </w:p>
+    <w:p>
+      <w:pPr>
+        <w:pStyle w:val="ListParagraph"/>
+        <w:rPr>
+          <w:b/>
+          <w:bCs/>
+        </w:rPr>
+      </w:pPr>
+    </w:p>
+    <w:p>
+      <w:pPr>
+        <w:pStyle w:val="ListParagraph"/>
+        <w:rPr>
+          <w:b/>
+          <w:bCs/>
+        </w:rPr>
+      </w:pPr>
+    </w:p>
+    <w:p>
+      <w:pPr>
+        <w:pStyle w:val="ListParagraph"/>
+        <w:rPr>
+          <w:b/>
+          <w:bCs/>
+        </w:rPr>
+      </w:pPr>
+    </w:p>
+    <w:p>
+      <w:pPr>
+        <w:pStyle w:val="ListParagraph"/>
+        <w:rPr>
+          <w:b/>
+          <w:bCs/>
+        </w:rPr>
+      </w:pPr>
+    </w:p>
+    <w:p>
+      <w:pPr>
+        <w:pStyle w:val="ListParagraph"/>
+        <w:rPr>
+          <w:b/>
+          <w:bCs/>
+        </w:rPr>
+      </w:pPr>
+      <w:r>
+        <w:rPr>
+          <w:b/>
+          <w:bCs/>
+        </w:rPr>
+        <w:lastRenderedPageBreak/>
+        <w:t xml:space="preserve">Simulation Log : </w:t>
+      </w:r>
+    </w:p>
+    <w:p>
+      <w:pPr>
+        <w:pStyle w:val="ListParagraph"/>
+      </w:pPr>
+    </w:p>
+    <w:p>
+      <w:pPr>
+        <w:pStyle w:val="ListParagraph"/>
+      </w:pPr>
+      <w:r>
+        <w:rPr>
+          <w:noProof/>
+        </w:rPr>
+        <w:drawing>
+          <wp:inline distT="0" distB="0" distL="0" distR="0" wp14:anchorId="49CDF9D7" wp14:editId="00EF41D2">
+            <wp:extent cx="5731510" cy="3220085"/>
+            <wp:effectExtent l="0" t="0" r="2540" b="0"/>
+            <wp:docPr id="506680233" name="Picture 1"/>
+            <wp:cNvGraphicFramePr>
+              <a:graphicFrameLocks xmlns:a="http://schemas.openxmlformats.org/drawingml/2006/main" noChangeAspect="1"/>
+            </wp:cNvGraphicFramePr>
+            <a:graphic xmlns:a="http://schemas.openxmlformats.org/drawingml/2006/main">
+              <a:graphicData uri="http://schemas.openxmlformats.org/drawingml/2006/picture">
+                <pic:pic xmlns:pic="http://schemas.openxmlformats.org/drawingml/2006/picture">
+                  <pic:nvPicPr>
+                    <pic:cNvPr id="506680233" name=""/>
+                    <pic:cNvPicPr/>
+                  </pic:nvPicPr>
+                  <pic:blipFill>
+                    <a:blip r:embed="rId9"/>
+                    <a:stretch>
+                      <a:fillRect/>
+                    </a:stretch>
+                  </pic:blipFill>
+                  <pic:spPr>
+                    <a:xfrm>
+                      <a:off x="0" y="0"/>
+                      <a:ext cx="5731510" cy="3220085"/>
+                    </a:xfrm>
+                    <a:prstGeom prst="rect">
+                      <a:avLst/>
+                    </a:prstGeom>
+                  </pic:spPr>
+                </pic:pic>
+              </a:graphicData>
+            </a:graphic>
+          </wp:inline>
+        </w:drawing>
+      </w:r>
+    </w:p>
+    <w:p>
+      <w:pPr>
+        <w:pStyle w:val="ListParagraph"/>
+      </w:pPr>
+      <w:r>
+        <w:rPr>
+          <w:noProof/>
+        </w:rPr>
+        <w:drawing>
+          <wp:inline distT="0" distB="0" distL="0" distR="0" wp14:anchorId="5D6F2BB6" wp14:editId="70098F28">
+            <wp:extent cx="5731510" cy="3220085"/>
+            <wp:effectExtent l="0" t="0" r="2540" b="0"/>
+            <wp:docPr id="103286685" name="Picture 1"/>
+            <wp:cNvGraphicFramePr>
+              <a:graphicFrameLocks xmlns:a="http://schemas.openxmlformats.org/drawingml/2006/main" noChangeAspect="1"/>
+            </wp:cNvGraphicFramePr>
+            <a:graphic xmlns:a="http://schemas.openxmlformats.org/drawingml/2006/main">
+              <a:graphicData uri="http://schemas.openxmlformats.org/drawingml/2006/picture">
+                <pic:pic xmlns:pic="http://schemas.openxmlformats.org/drawingml/2006/picture">
+                  <pic:nvPicPr>
+                    <pic:cNvPr id="103286685" name=""/>
+                    <pic:cNvPicPr/>
+                  </pic:nvPicPr>
+                  <pic:blipFill>
+                    <a:blip r:embed="rId10"/>
+                    <a:stretch>
+                      <a:fillRect/>
+                    </a:stretch>
+                  </pic:blipFill>
+                  <pic:spPr>
+                    <a:xfrm>
+                      <a:off x="0" y="0"/>
+                      <a:ext cx="5731510" cy="3220085"/>
+                    </a:xfrm>
+                    <a:prstGeom prst="rect">
+                      <a:avLst/>
+                    </a:prstGeom>
+                  </pic:spPr>
+                </pic:pic>
+              </a:graphicData>
+            </a:graphic>
+          </wp:inline>
+        </w:drawing>
+      </w:r>
     </w:p>
     <w:p>
       <w:pPr>
@@ -1059,7 +1217,7 @@
                     </pic:cNvPicPr>
                   </pic:nvPicPr>
                   <pic:blipFill rotWithShape="1">
-                    <a:blip r:embed="rId6" cstate="print">
+                    <a:blip r:embed="rId11" cstate="print">
                       <a:extLst>
                         <a:ext uri="{28A0092B-C50C-407E-A947-70E740481C1C}">
                           <a14:useLocalDpi xmlns:a14="http://schemas.microsoft.com/office/drawing/2010/main" val="0"/>
@@ -1180,6 +1338,18 @@
     <w:p>
       <w:pPr>
         <w:pStyle w:val="ListParagraph"/>
+        <w:numPr>
+          <w:ilvl w:val="0"/>
+          <w:numId w:val="1"/>
+        </w:numPr>
+      </w:pPr>
+      <w:r>
+        <w:t>Implement the Mealy FSM in Verilog HDL.</w:t>
+      </w:r>
+    </w:p>
+    <w:p>
+      <w:pPr>
+        <w:pStyle w:val="ListParagraph"/>
         <w:rPr>
           <w:b/>
           <w:bCs/>
@@ -1416,6 +1586,7 @@
         <w:pStyle w:val="ListParagraph"/>
       </w:pPr>
       <w:r>
+        <w:lastRenderedPageBreak/>
         <w:tab/>
       </w:r>
       <w:r>
@@ -1428,7 +1599,6 @@
         <w:pStyle w:val="ListParagraph"/>
       </w:pPr>
       <w:r>
-        <w:lastRenderedPageBreak/>
         <w:tab/>
       </w:r>
       <w:r>
@@ -1896,11 +2066,6 @@
       <w:r>
         <w:t>endmodule</w:t>
       </w:r>
-    </w:p>
-    <w:p>
-      <w:pPr>
-        <w:pStyle w:val="ListParagraph"/>
-      </w:pPr>
     </w:p>
     <w:p>
       <w:pPr>
@@ -1910,12 +2075,206 @@
           <w:bCs/>
         </w:rPr>
       </w:pPr>
-      <w:r>
+    </w:p>
+    <w:p>
+      <w:pPr>
+        <w:pStyle w:val="ListParagraph"/>
         <w:rPr>
           <w:b/>
           <w:bCs/>
         </w:rPr>
-        <w:lastRenderedPageBreak/>
+      </w:pPr>
+    </w:p>
+    <w:p>
+      <w:pPr>
+        <w:pStyle w:val="ListParagraph"/>
+        <w:rPr>
+          <w:b/>
+          <w:bCs/>
+        </w:rPr>
+      </w:pPr>
+      <w:r>
+        <w:rPr>
+          <w:b/>
+          <w:bCs/>
+        </w:rPr>
+        <w:t xml:space="preserve">Compilation Log : </w:t>
+      </w:r>
+    </w:p>
+    <w:p>
+      <w:pPr>
+        <w:pStyle w:val="ListParagraph"/>
+        <w:rPr>
+          <w:b/>
+          <w:bCs/>
+        </w:rPr>
+      </w:pPr>
+      <w:r>
+        <w:rPr>
+          <w:b/>
+          <w:bCs/>
+          <w:noProof/>
+        </w:rPr>
+        <w:drawing>
+          <wp:inline distT="0" distB="0" distL="0" distR="0" wp14:anchorId="18EA260F" wp14:editId="304674B8">
+            <wp:extent cx="5731510" cy="3220085"/>
+            <wp:effectExtent l="0" t="0" r="2540" b="0"/>
+            <wp:docPr id="1493612965" name="Picture 1"/>
+            <wp:cNvGraphicFramePr>
+              <a:graphicFrameLocks xmlns:a="http://schemas.openxmlformats.org/drawingml/2006/main" noChangeAspect="1"/>
+            </wp:cNvGraphicFramePr>
+            <a:graphic xmlns:a="http://schemas.openxmlformats.org/drawingml/2006/main">
+              <a:graphicData uri="http://schemas.openxmlformats.org/drawingml/2006/picture">
+                <pic:pic xmlns:pic="http://schemas.openxmlformats.org/drawingml/2006/picture">
+                  <pic:nvPicPr>
+                    <pic:cNvPr id="1493612965" name=""/>
+                    <pic:cNvPicPr/>
+                  </pic:nvPicPr>
+                  <pic:blipFill>
+                    <a:blip r:embed="rId12"/>
+                    <a:stretch>
+                      <a:fillRect/>
+                    </a:stretch>
+                  </pic:blipFill>
+                  <pic:spPr>
+                    <a:xfrm>
+                      <a:off x="0" y="0"/>
+                      <a:ext cx="5731510" cy="3220085"/>
+                    </a:xfrm>
+                    <a:prstGeom prst="rect">
+                      <a:avLst/>
+                    </a:prstGeom>
+                  </pic:spPr>
+                </pic:pic>
+              </a:graphicData>
+            </a:graphic>
+          </wp:inline>
+        </w:drawing>
+      </w:r>
+    </w:p>
+    <w:p>
+      <w:pPr>
+        <w:pStyle w:val="ListParagraph"/>
+        <w:rPr>
+          <w:b/>
+          <w:bCs/>
+        </w:rPr>
+      </w:pPr>
+    </w:p>
+    <w:p>
+      <w:pPr>
+        <w:pStyle w:val="ListParagraph"/>
+        <w:rPr>
+          <w:b/>
+          <w:bCs/>
+        </w:rPr>
+      </w:pPr>
+    </w:p>
+    <w:p>
+      <w:pPr>
+        <w:pStyle w:val="ListParagraph"/>
+        <w:rPr>
+          <w:b/>
+          <w:bCs/>
+        </w:rPr>
+      </w:pPr>
+      <w:r>
+        <w:rPr>
+          <w:b/>
+          <w:bCs/>
+        </w:rPr>
+        <w:t xml:space="preserve">Simulation Log : </w:t>
+      </w:r>
+    </w:p>
+    <w:p>
+      <w:pPr>
+        <w:pStyle w:val="ListParagraph"/>
+      </w:pPr>
+      <w:r>
+        <w:rPr>
+          <w:noProof/>
+        </w:rPr>
+        <w:drawing>
+          <wp:inline distT="0" distB="0" distL="0" distR="0" wp14:anchorId="1DAE34F4" wp14:editId="258633F3">
+            <wp:extent cx="5731510" cy="3220085"/>
+            <wp:effectExtent l="0" t="0" r="2540" b="0"/>
+            <wp:docPr id="150074794" name="Picture 1"/>
+            <wp:cNvGraphicFramePr>
+              <a:graphicFrameLocks xmlns:a="http://schemas.openxmlformats.org/drawingml/2006/main" noChangeAspect="1"/>
+            </wp:cNvGraphicFramePr>
+            <a:graphic xmlns:a="http://schemas.openxmlformats.org/drawingml/2006/main">
+              <a:graphicData uri="http://schemas.openxmlformats.org/drawingml/2006/picture">
+                <pic:pic xmlns:pic="http://schemas.openxmlformats.org/drawingml/2006/picture">
+                  <pic:nvPicPr>
+                    <pic:cNvPr id="150074794" name=""/>
+                    <pic:cNvPicPr/>
+                  </pic:nvPicPr>
+                  <pic:blipFill>
+                    <a:blip r:embed="rId13"/>
+                    <a:stretch>
+                      <a:fillRect/>
+                    </a:stretch>
+                  </pic:blipFill>
+                  <pic:spPr>
+                    <a:xfrm>
+                      <a:off x="0" y="0"/>
+                      <a:ext cx="5731510" cy="3220085"/>
+                    </a:xfrm>
+                    <a:prstGeom prst="rect">
+                      <a:avLst/>
+                    </a:prstGeom>
+                  </pic:spPr>
+                </pic:pic>
+              </a:graphicData>
+            </a:graphic>
+          </wp:inline>
+        </w:drawing>
+      </w:r>
+    </w:p>
+    <w:p>
+      <w:pPr>
+        <w:pStyle w:val="ListParagraph"/>
+      </w:pPr>
+    </w:p>
+    <w:p>
+      <w:pPr>
+        <w:pStyle w:val="ListParagraph"/>
+      </w:pPr>
+    </w:p>
+    <w:p>
+      <w:pPr>
+        <w:pStyle w:val="ListParagraph"/>
+      </w:pPr>
+    </w:p>
+    <w:p>
+      <w:pPr>
+        <w:pStyle w:val="ListParagraph"/>
+        <w:rPr>
+          <w:b/>
+          <w:bCs/>
+        </w:rPr>
+      </w:pPr>
+    </w:p>
+    <w:p>
+      <w:pPr>
+        <w:rPr>
+          <w:b/>
+          <w:bCs/>
+        </w:rPr>
+      </w:pPr>
+    </w:p>
+    <w:p>
+      <w:pPr>
+        <w:rPr>
+          <w:b/>
+          <w:bCs/>
+        </w:rPr>
+      </w:pPr>
+      <w:r>
+        <w:rPr>
+          <w:b/>
+          <w:bCs/>
+        </w:rPr>
         <w:t xml:space="preserve">Overlapping Case : </w:t>
       </w:r>
     </w:p>
@@ -1954,7 +2313,7 @@
                     </pic:cNvPicPr>
                   </pic:nvPicPr>
                   <pic:blipFill rotWithShape="1">
-                    <a:blip r:embed="rId7" cstate="print">
+                    <a:blip r:embed="rId14" cstate="print">
                       <a:extLst>
                         <a:ext uri="{28A0092B-C50C-407E-A947-70E740481C1C}">
                           <a14:useLocalDpi xmlns:a14="http://schemas.microsoft.com/office/drawing/2010/main" val="0"/>
@@ -2536,19 +2895,267 @@
         <w:t>end</w:t>
       </w:r>
     </w:p>
-    <w:p/>
     <w:p>
       <w:r>
         <w:t>endmodule</w:t>
       </w:r>
     </w:p>
     <w:p>
-      <w:r>
+      <w:pPr>
         <w:rPr>
           <w:b/>
           <w:bCs/>
         </w:rPr>
-        <w:tab/>
+      </w:pPr>
+    </w:p>
+    <w:p>
+      <w:pPr>
+        <w:rPr>
+          <w:b/>
+          <w:bCs/>
+        </w:rPr>
+      </w:pPr>
+      <w:r>
+        <w:rPr>
+          <w:b/>
+          <w:bCs/>
+        </w:rPr>
+        <w:t xml:space="preserve">Compilation Log : </w:t>
+      </w:r>
+    </w:p>
+    <w:p>
+      <w:pPr>
+        <w:rPr>
+          <w:b/>
+          <w:bCs/>
+        </w:rPr>
+      </w:pPr>
+      <w:r>
+        <w:rPr>
+          <w:b/>
+          <w:bCs/>
+          <w:noProof/>
+        </w:rPr>
+        <w:drawing>
+          <wp:inline distT="0" distB="0" distL="0" distR="0" wp14:anchorId="46F88670" wp14:editId="636913F6">
+            <wp:extent cx="5731510" cy="3220085"/>
+            <wp:effectExtent l="0" t="0" r="2540" b="0"/>
+            <wp:docPr id="1639472159" name="Picture 1"/>
+            <wp:cNvGraphicFramePr>
+              <a:graphicFrameLocks xmlns:a="http://schemas.openxmlformats.org/drawingml/2006/main" noChangeAspect="1"/>
+            </wp:cNvGraphicFramePr>
+            <a:graphic xmlns:a="http://schemas.openxmlformats.org/drawingml/2006/main">
+              <a:graphicData uri="http://schemas.openxmlformats.org/drawingml/2006/picture">
+                <pic:pic xmlns:pic="http://schemas.openxmlformats.org/drawingml/2006/picture">
+                  <pic:nvPicPr>
+                    <pic:cNvPr id="1639472159" name=""/>
+                    <pic:cNvPicPr/>
+                  </pic:nvPicPr>
+                  <pic:blipFill>
+                    <a:blip r:embed="rId15"/>
+                    <a:stretch>
+                      <a:fillRect/>
+                    </a:stretch>
+                  </pic:blipFill>
+                  <pic:spPr>
+                    <a:xfrm>
+                      <a:off x="0" y="0"/>
+                      <a:ext cx="5731510" cy="3220085"/>
+                    </a:xfrm>
+                    <a:prstGeom prst="rect">
+                      <a:avLst/>
+                    </a:prstGeom>
+                  </pic:spPr>
+                </pic:pic>
+              </a:graphicData>
+            </a:graphic>
+          </wp:inline>
+        </w:drawing>
+      </w:r>
+    </w:p>
+    <w:p>
+      <w:pPr>
+        <w:rPr>
+          <w:b/>
+          <w:bCs/>
+        </w:rPr>
+      </w:pPr>
+      <w:r>
+        <w:rPr>
+          <w:b/>
+          <w:bCs/>
+        </w:rPr>
+        <w:t xml:space="preserve">Simulation Log : </w:t>
+      </w:r>
+    </w:p>
+    <w:p>
+      <w:r>
+        <w:rPr>
+          <w:noProof/>
+        </w:rPr>
+        <w:drawing>
+          <wp:inline distT="0" distB="0" distL="0" distR="0" wp14:anchorId="1C473F8E" wp14:editId="617D15ED">
+            <wp:extent cx="5731510" cy="3220085"/>
+            <wp:effectExtent l="0" t="0" r="2540" b="0"/>
+            <wp:docPr id="915114481" name="Picture 1"/>
+            <wp:cNvGraphicFramePr>
+              <a:graphicFrameLocks xmlns:a="http://schemas.openxmlformats.org/drawingml/2006/main" noChangeAspect="1"/>
+            </wp:cNvGraphicFramePr>
+            <a:graphic xmlns:a="http://schemas.openxmlformats.org/drawingml/2006/main">
+              <a:graphicData uri="http://schemas.openxmlformats.org/drawingml/2006/picture">
+                <pic:pic xmlns:pic="http://schemas.openxmlformats.org/drawingml/2006/picture">
+                  <pic:nvPicPr>
+                    <pic:cNvPr id="915114481" name=""/>
+                    <pic:cNvPicPr/>
+                  </pic:nvPicPr>
+                  <pic:blipFill>
+                    <a:blip r:embed="rId16"/>
+                    <a:stretch>
+                      <a:fillRect/>
+                    </a:stretch>
+                  </pic:blipFill>
+                  <pic:spPr>
+                    <a:xfrm>
+                      <a:off x="0" y="0"/>
+                      <a:ext cx="5731510" cy="3220085"/>
+                    </a:xfrm>
+                    <a:prstGeom prst="rect">
+                      <a:avLst/>
+                    </a:prstGeom>
+                  </pic:spPr>
+                </pic:pic>
+              </a:graphicData>
+            </a:graphic>
+          </wp:inline>
+        </w:drawing>
+      </w:r>
+    </w:p>
+    <w:p>
+      <w:pPr>
+        <w:pStyle w:val="ListParagraph"/>
+        <w:numPr>
+          <w:ilvl w:val="0"/>
+          <w:numId w:val="1"/>
+        </w:numPr>
+      </w:pPr>
+      <w:r>
+        <w:lastRenderedPageBreak/>
+        <w:t>Compare Mealy and Moore FSM implementations.</w:t>
+      </w:r>
+    </w:p>
+    <w:p>
+      <w:pPr>
+        <w:pStyle w:val="ListParagraph"/>
+      </w:pPr>
+    </w:p>
+    <w:p>
+      <w:pPr>
+        <w:pStyle w:val="ListParagraph"/>
+        <w:rPr>
+          <w:b/>
+          <w:bCs/>
+        </w:rPr>
+      </w:pPr>
+      <w:r>
+        <w:rPr>
+          <w:b/>
+          <w:bCs/>
+        </w:rPr>
+        <w:t xml:space="preserve">Mealy Machine : </w:t>
+      </w:r>
+    </w:p>
+    <w:p>
+      <w:pPr>
+        <w:pStyle w:val="ListParagraph"/>
+        <w:numPr>
+          <w:ilvl w:val="0"/>
+          <w:numId w:val="2"/>
+        </w:numPr>
+      </w:pPr>
+      <w:r>
+        <w:t>The output depends on Present state and Past Input.</w:t>
+      </w:r>
+      <w:r>
+        <w:t xml:space="preserve"> [</w:t>
+      </w:r>
+      <w:r>
+        <w:t>always @(PS or data_in)</w:t>
+      </w:r>
+      <w:r>
+        <w:t>]</w:t>
+      </w:r>
+    </w:p>
+    <w:p>
+      <w:pPr>
+        <w:pStyle w:val="ListParagraph"/>
+        <w:numPr>
+          <w:ilvl w:val="0"/>
+          <w:numId w:val="2"/>
+        </w:numPr>
+      </w:pPr>
+      <w:r>
+        <w:t xml:space="preserve">Unregister output and </w:t>
+      </w:r>
+      <w:r>
+        <w:t>no</w:t>
+      </w:r>
+      <w:r>
+        <w:t xml:space="preserve"> extra state</w:t>
+      </w:r>
+    </w:p>
+    <w:p>
+      <w:pPr>
+        <w:ind w:left="720"/>
+        <w:rPr>
+          <w:b/>
+          <w:bCs/>
+        </w:rPr>
+      </w:pPr>
+      <w:r>
+        <w:rPr>
+          <w:b/>
+          <w:bCs/>
+        </w:rPr>
+        <w:t>Moore Machine :</w:t>
+      </w:r>
+    </w:p>
+    <w:p>
+      <w:pPr>
+        <w:pStyle w:val="ListParagraph"/>
+        <w:numPr>
+          <w:ilvl w:val="0"/>
+          <w:numId w:val="3"/>
+        </w:numPr>
+      </w:pPr>
+      <w:r>
+        <w:t>The output depends only on Present state.</w:t>
+      </w:r>
+      <w:r>
+        <w:t xml:space="preserve"> [</w:t>
+      </w:r>
+      <w:r>
+        <w:t>always @(PS)</w:t>
+      </w:r>
+      <w:r>
+        <w:t>]</w:t>
+      </w:r>
+    </w:p>
+    <w:p>
+      <w:pPr>
+        <w:pStyle w:val="ListParagraph"/>
+        <w:numPr>
+          <w:ilvl w:val="0"/>
+          <w:numId w:val="3"/>
+        </w:numPr>
+      </w:pPr>
+      <w:r>
+        <w:t xml:space="preserve">Many </w:t>
+      </w:r>
+      <w:r>
+        <w:t>m</w:t>
+      </w:r>
+      <w:r>
+        <w:t>ore additional states and registered output.</w:t>
       </w:r>
     </w:p>
     <w:p>
@@ -2569,6 +3176,232 @@
 <file path=word/numbering.xml><?xml version="1.0" encoding="utf-8"?>
 <w:numbering xmlns:wpc="http://schemas.microsoft.com/office/word/2010/wordprocessingCanvas" xmlns:cx="http://schemas.microsoft.com/office/drawing/2014/chartex" xmlns:cx1="http://schemas.microsoft.com/office/drawing/2015/9/8/chartex" xmlns:cx2="http://schemas.microsoft.com/office/drawing/2015/10/21/chartex" xmlns:cx3="http://schemas.microsoft.com/office/drawing/2016/5/9/chartex" xmlns:cx4="http://schemas.microsoft.com/office/drawing/2016/5/10/chartex" xmlns:cx5="http://schemas.microsoft.com/office/drawing/2016/5/11/chartex" xmlns:cx6="http://schemas.microsoft.com/office/drawing/2016/5/12/chartex" xmlns:cx7="http://schemas.microsoft.com/office/drawing/2016/5/13/chartex" xmlns:cx8="http://schemas.microsoft.com/office/drawing/2016/5/14/chartex" xmlns:mc="http://schemas.openxmlformats.org/markup-compatibility/2006" xmlns:aink="http://schemas.microsoft.com/office/drawing/2016/ink" xmlns:am3d="http://schemas.microsoft.com/office/drawing/2017/model3d" xmlns:o="urn:schemas-microsoft-com:office:office" xmlns:oel="http://schemas.microsoft.com/office/2019/extlst" xmlns:r="http://schemas.openxmlformats.org/officeDocument/2006/relationships" xmlns:m="http://schemas.openxmlformats.org/officeDocument/2006/math" xmlns:v="urn:schemas-microsoft-com:vml" xmlns:wp14="http://schemas.microsoft.com/office/word/2010/wordprocessingDrawing" xmlns:wp="http://schemas.openxmlformats.org/drawingml/2006/wordprocessingDrawing" xmlns:w10="urn:schemas-microsoft-com:office:word" xmlns:w="http://schemas.openxmlformats.org/wordprocessingml/2006/main" xmlns:w14="http://schemas.microsoft.com/office/word/2010/wordml" xmlns:w15="http://schemas.microsoft.com/office/word/2012/wordml" xmlns:w16cex="http://schemas.microsoft.com/office/word/2018/wordml/cex" xmlns:w16cid="http://schemas.microsoft.com/office/word/2016/wordml/cid" xmlns:w16="http://schemas.microsoft.com/office/word/2018/wordml" xmlns:w16du="http://schemas.microsoft.com/office/word/2023/wordml/word16du" xmlns:w16sdtdh="http://schemas.microsoft.com/office/word/2020/wordml/sdtdatahash" xmlns:w16sdtfl="http://schemas.microsoft.com/office/word/2024/wordml/sdtformatlock" xmlns:w16se="http://schemas.microsoft.com/office/word/2015/wordml/symex" xmlns:wpg="http://schemas.microsoft.com/office/word/2010/wordprocessingGroup" xmlns:wpi="http://schemas.microsoft.com/office/word/2010/wordprocessingInk" xmlns:wne="http://schemas.microsoft.com/office/word/2006/wordml" xmlns:wps="http://schemas.microsoft.com/office/word/2010/wordprocessingShape" mc:Ignorable="w14 w15 w16se w16cid w16 w16cex w16sdtdh w16sdtfl w16du wp14">
   <w:abstractNum w:abstractNumId="0" w15:restartNumberingAfterBreak="0">
+    <w:nsid w:val="0BE57DB2"/>
+    <w:multiLevelType w:val="hybridMultilevel"/>
+    <w:tmpl w:val="C4E62692"/>
+    <w:lvl w:ilvl="0" w:tplc="40090001">
+      <w:start w:val="1"/>
+      <w:numFmt w:val="bullet"/>
+      <w:lvlText w:val=""/>
+      <w:lvlJc w:val="left"/>
+      <w:pPr>
+        <w:ind w:left="1440" w:hanging="360"/>
+      </w:pPr>
+      <w:rPr>
+        <w:rFonts w:ascii="Symbol" w:hAnsi="Symbol" w:hint="default"/>
+      </w:rPr>
+    </w:lvl>
+    <w:lvl w:ilvl="1" w:tplc="40090003" w:tentative="1">
+      <w:start w:val="1"/>
+      <w:numFmt w:val="bullet"/>
+      <w:lvlText w:val="o"/>
+      <w:lvlJc w:val="left"/>
+      <w:pPr>
+        <w:ind w:left="2160" w:hanging="360"/>
+      </w:pPr>
+      <w:rPr>
+        <w:rFonts w:ascii="Courier New" w:hAnsi="Courier New" w:cs="Courier New" w:hint="default"/>
+      </w:rPr>
+    </w:lvl>
+    <w:lvl w:ilvl="2" w:tplc="40090005" w:tentative="1">
+      <w:start w:val="1"/>
+      <w:numFmt w:val="bullet"/>
+      <w:lvlText w:val=""/>
+      <w:lvlJc w:val="left"/>
+      <w:pPr>
+        <w:ind w:left="2880" w:hanging="360"/>
+      </w:pPr>
+      <w:rPr>
+        <w:rFonts w:ascii="Wingdings" w:hAnsi="Wingdings" w:hint="default"/>
+      </w:rPr>
+    </w:lvl>
+    <w:lvl w:ilvl="3" w:tplc="40090001" w:tentative="1">
+      <w:start w:val="1"/>
+      <w:numFmt w:val="bullet"/>
+      <w:lvlText w:val=""/>
+      <w:lvlJc w:val="left"/>
+      <w:pPr>
+        <w:ind w:left="3600" w:hanging="360"/>
+      </w:pPr>
+      <w:rPr>
+        <w:rFonts w:ascii="Symbol" w:hAnsi="Symbol" w:hint="default"/>
+      </w:rPr>
+    </w:lvl>
+    <w:lvl w:ilvl="4" w:tplc="40090003" w:tentative="1">
+      <w:start w:val="1"/>
+      <w:numFmt w:val="bullet"/>
+      <w:lvlText w:val="o"/>
+      <w:lvlJc w:val="left"/>
+      <w:pPr>
+        <w:ind w:left="4320" w:hanging="360"/>
+      </w:pPr>
+      <w:rPr>
+        <w:rFonts w:ascii="Courier New" w:hAnsi="Courier New" w:cs="Courier New" w:hint="default"/>
+      </w:rPr>
+    </w:lvl>
+    <w:lvl w:ilvl="5" w:tplc="40090005" w:tentative="1">
+      <w:start w:val="1"/>
+      <w:numFmt w:val="bullet"/>
+      <w:lvlText w:val=""/>
+      <w:lvlJc w:val="left"/>
+      <w:pPr>
+        <w:ind w:left="5040" w:hanging="360"/>
+      </w:pPr>
+      <w:rPr>
+        <w:rFonts w:ascii="Wingdings" w:hAnsi="Wingdings" w:hint="default"/>
+      </w:rPr>
+    </w:lvl>
+    <w:lvl w:ilvl="6" w:tplc="40090001" w:tentative="1">
+      <w:start w:val="1"/>
+      <w:numFmt w:val="bullet"/>
+      <w:lvlText w:val=""/>
+      <w:lvlJc w:val="left"/>
+      <w:pPr>
+        <w:ind w:left="5760" w:hanging="360"/>
+      </w:pPr>
+      <w:rPr>
+        <w:rFonts w:ascii="Symbol" w:hAnsi="Symbol" w:hint="default"/>
+      </w:rPr>
+    </w:lvl>
+    <w:lvl w:ilvl="7" w:tplc="40090003" w:tentative="1">
+      <w:start w:val="1"/>
+      <w:numFmt w:val="bullet"/>
+      <w:lvlText w:val="o"/>
+      <w:lvlJc w:val="left"/>
+      <w:pPr>
+        <w:ind w:left="6480" w:hanging="360"/>
+      </w:pPr>
+      <w:rPr>
+        <w:rFonts w:ascii="Courier New" w:hAnsi="Courier New" w:cs="Courier New" w:hint="default"/>
+      </w:rPr>
+    </w:lvl>
+    <w:lvl w:ilvl="8" w:tplc="40090005" w:tentative="1">
+      <w:start w:val="1"/>
+      <w:numFmt w:val="bullet"/>
+      <w:lvlText w:val=""/>
+      <w:lvlJc w:val="left"/>
+      <w:pPr>
+        <w:ind w:left="7200" w:hanging="360"/>
+      </w:pPr>
+      <w:rPr>
+        <w:rFonts w:ascii="Wingdings" w:hAnsi="Wingdings" w:hint="default"/>
+      </w:rPr>
+    </w:lvl>
+  </w:abstractNum>
+  <w:abstractNum w:abstractNumId="1" w15:restartNumberingAfterBreak="0">
+    <w:nsid w:val="55223668"/>
+    <w:multiLevelType w:val="hybridMultilevel"/>
+    <w:tmpl w:val="F642FAEA"/>
+    <w:lvl w:ilvl="0" w:tplc="40090001">
+      <w:start w:val="1"/>
+      <w:numFmt w:val="bullet"/>
+      <w:lvlText w:val=""/>
+      <w:lvlJc w:val="left"/>
+      <w:pPr>
+        <w:ind w:left="1440" w:hanging="360"/>
+      </w:pPr>
+      <w:rPr>
+        <w:rFonts w:ascii="Symbol" w:hAnsi="Symbol" w:hint="default"/>
+      </w:rPr>
+    </w:lvl>
+    <w:lvl w:ilvl="1" w:tplc="40090003" w:tentative="1">
+      <w:start w:val="1"/>
+      <w:numFmt w:val="bullet"/>
+      <w:lvlText w:val="o"/>
+      <w:lvlJc w:val="left"/>
+      <w:pPr>
+        <w:ind w:left="2160" w:hanging="360"/>
+      </w:pPr>
+      <w:rPr>
+        <w:rFonts w:ascii="Courier New" w:hAnsi="Courier New" w:cs="Courier New" w:hint="default"/>
+      </w:rPr>
+    </w:lvl>
+    <w:lvl w:ilvl="2" w:tplc="40090005" w:tentative="1">
+      <w:start w:val="1"/>
+      <w:numFmt w:val="bullet"/>
+      <w:lvlText w:val=""/>
+      <w:lvlJc w:val="left"/>
+      <w:pPr>
+        <w:ind w:left="2880" w:hanging="360"/>
+      </w:pPr>
+      <w:rPr>
+        <w:rFonts w:ascii="Wingdings" w:hAnsi="Wingdings" w:hint="default"/>
+      </w:rPr>
+    </w:lvl>
+    <w:lvl w:ilvl="3" w:tplc="40090001" w:tentative="1">
+      <w:start w:val="1"/>
+      <w:numFmt w:val="bullet"/>
+      <w:lvlText w:val=""/>
+      <w:lvlJc w:val="left"/>
+      <w:pPr>
+        <w:ind w:left="3600" w:hanging="360"/>
+      </w:pPr>
+      <w:rPr>
+        <w:rFonts w:ascii="Symbol" w:hAnsi="Symbol" w:hint="default"/>
+      </w:rPr>
+    </w:lvl>
+    <w:lvl w:ilvl="4" w:tplc="40090003" w:tentative="1">
+      <w:start w:val="1"/>
+      <w:numFmt w:val="bullet"/>
+      <w:lvlText w:val="o"/>
+      <w:lvlJc w:val="left"/>
+      <w:pPr>
+        <w:ind w:left="4320" w:hanging="360"/>
+      </w:pPr>
+      <w:rPr>
+        <w:rFonts w:ascii="Courier New" w:hAnsi="Courier New" w:cs="Courier New" w:hint="default"/>
+      </w:rPr>
+    </w:lvl>
+    <w:lvl w:ilvl="5" w:tplc="40090005" w:tentative="1">
+      <w:start w:val="1"/>
+      <w:numFmt w:val="bullet"/>
+      <w:lvlText w:val=""/>
+      <w:lvlJc w:val="left"/>
+      <w:pPr>
+        <w:ind w:left="5040" w:hanging="360"/>
+      </w:pPr>
+      <w:rPr>
+        <w:rFonts w:ascii="Wingdings" w:hAnsi="Wingdings" w:hint="default"/>
+      </w:rPr>
+    </w:lvl>
+    <w:lvl w:ilvl="6" w:tplc="40090001" w:tentative="1">
+      <w:start w:val="1"/>
+      <w:numFmt w:val="bullet"/>
+      <w:lvlText w:val=""/>
+      <w:lvlJc w:val="left"/>
+      <w:pPr>
+        <w:ind w:left="5760" w:hanging="360"/>
+      </w:pPr>
+      <w:rPr>
+        <w:rFonts w:ascii="Symbol" w:hAnsi="Symbol" w:hint="default"/>
+      </w:rPr>
+    </w:lvl>
+    <w:lvl w:ilvl="7" w:tplc="40090003" w:tentative="1">
+      <w:start w:val="1"/>
+      <w:numFmt w:val="bullet"/>
+      <w:lvlText w:val="o"/>
+      <w:lvlJc w:val="left"/>
+      <w:pPr>
+        <w:ind w:left="6480" w:hanging="360"/>
+      </w:pPr>
+      <w:rPr>
+        <w:rFonts w:ascii="Courier New" w:hAnsi="Courier New" w:cs="Courier New" w:hint="default"/>
+      </w:rPr>
+    </w:lvl>
+    <w:lvl w:ilvl="8" w:tplc="40090005" w:tentative="1">
+      <w:start w:val="1"/>
+      <w:numFmt w:val="bullet"/>
+      <w:lvlText w:val=""/>
+      <w:lvlJc w:val="left"/>
+      <w:pPr>
+        <w:ind w:left="7200" w:hanging="360"/>
+      </w:pPr>
+      <w:rPr>
+        <w:rFonts w:ascii="Wingdings" w:hAnsi="Wingdings" w:hint="default"/>
+      </w:rPr>
+    </w:lvl>
+  </w:abstractNum>
+  <w:abstractNum w:abstractNumId="2" w15:restartNumberingAfterBreak="0">
     <w:nsid w:val="5FD658D0"/>
     <w:multiLevelType w:val="hybridMultilevel"/>
     <w:tmpl w:val="A8D43EFA"/>
@@ -2658,7 +3491,13 @@
     </w:lvl>
   </w:abstractNum>
   <w:num w:numId="1" w16cid:durableId="1710256451">
+    <w:abstractNumId w:val="2"/>
+  </w:num>
+  <w:num w:numId="2" w16cid:durableId="2101825884">
     <w:abstractNumId w:val="0"/>
+  </w:num>
+  <w:num w:numId="3" w16cid:durableId="1742557007">
+    <w:abstractNumId w:val="1"/>
   </w:num>
 </w:numbering>
 </file>
@@ -3596,6 +4435,29 @@
       <w14:ligatures w14:val="none"/>
     </w:rPr>
   </w:style>
+  <w:style w:type="character" w:styleId="Hyperlink">
+    <w:name w:val="Hyperlink"/>
+    <w:basedOn w:val="DefaultParagraphFont"/>
+    <w:uiPriority w:val="99"/>
+    <w:unhideWhenUsed/>
+    <w:rsid w:val="0056449B"/>
+    <w:rPr>
+      <w:color w:val="0563C1" w:themeColor="hyperlink"/>
+      <w:u w:val="single"/>
+    </w:rPr>
+  </w:style>
+  <w:style w:type="character" w:styleId="UnresolvedMention">
+    <w:name w:val="Unresolved Mention"/>
+    <w:basedOn w:val="DefaultParagraphFont"/>
+    <w:uiPriority w:val="99"/>
+    <w:semiHidden/>
+    <w:unhideWhenUsed/>
+    <w:rsid w:val="0056449B"/>
+    <w:rPr>
+      <w:color w:val="605E5C"/>
+      <w:shd w:val="clear" w:color="auto" w:fill="E1DFDD"/>
+    </w:rPr>
+  </w:style>
 </w:styles>
 </file>
 

</xml_diff>